<commit_message>
Fix the user guides so Microsoft Word can open them.
Word rejected the files because the document date included milliseconds and the page number field was packed into one run.

Co-authored-by: Cursor <cursoragent@cursor.com>
</commit_message>
<xml_diff>
--- a/docs/user-manuals/STS_Staff_Client_User_Guide_V1.docx
+++ b/docs/user-manuals/STS_Staff_Client_User_Guide_V1.docx
@@ -78,8 +78,17 @@
         <w:szCs w:val="16"/>
       </w:rPr>
       <w:fldChar w:fldCharType="begin"/>
-      <w:instrText xml:space="preserve">PAGE</w:instrText>
+    </w:r>
+    <w:r>
+      <w:instrText xml:space="preserve"> PAGE </w:instrText>
+    </w:r>
+    <w:r>
       <w:fldChar w:fldCharType="separate"/>
+    </w:r>
+    <w:r>
+      <w:t>1</w:t>
+    </w:r>
+    <w:r>
       <w:fldChar w:fldCharType="end"/>
     </w:r>
     <w:r>
@@ -258,6 +267,21 @@
     <w:rPrDefault/>
     <w:pPrDefault/>
   </w:docDefaults>
+  <w:style w:type="paragraph" w:default="1" w:styleId="Normal">
+    <w:name w:val="Normal"/>
+    <w:qFormat/>
+    <w:rPr>
+      <w:rFonts w:ascii="Times New Roman" w:hAnsi="Times New Roman" w:cs="Times New Roman" w:eastAsia="Times New Roman"/>
+      <w:sz w:val="22"/>
+      <w:szCs w:val="22"/>
+    </w:rPr>
+  </w:style>
+  <w:style w:type="character" w:default="1" w:styleId="DefaultParagraphFont">
+    <w:name w:val="Default Paragraph Font"/>
+    <w:uiPriority w:val="1"/>
+    <w:semiHidden/>
+    <w:unhideWhenUsed/>
+  </w:style>
   <w:style w:type="paragraph" w:styleId="Title">
     <w:name w:val="Title"/>
     <w:basedOn w:val="Normal"/>

</xml_diff>